<commit_message>
CV: clickable phone, LinkedIn as a label, no "senior" claim
- Phone is a tel: link; LinkedIn shows as "LinkedIn". Email and phone
  stay as visible text so ATS parsers and print still carry them.
- "grew from individual contributor to senior designer" contradicted the
  official "Experienced Product Designer" title. Now "to team lead",
  which is what happened. Same fix in the terminal about.
- bump-cache.sh

Co-Authored-By: Claude Opus 5.5 <noreply@anthropic.com>
Claude-Session: https://claude.ai/code/session_01UR5wgWCykGrjr29FfUPuRZ
</commit_message>
<xml_diff>
--- a/Assets/CV/Ori_Cohen_CV.docx
+++ b/Assets/CV/Ori_Cohen_CV.docx
@@ -54,7 +54,7 @@
         </w:rPr>
         <w:t xml:space="preserve">  ·  </w:t>
       </w:r>
-      <w:hyperlink w:history="1" r:id="rId7x0gabb0jctoirabxgqx-">
+      <w:hyperlink w:history="1" r:id="rIdyej7nsvrf28e3d3cmx-fn">
         <w:r>
           <w:rPr>
             <w:rFonts w:ascii="Calibri" w:cs="Calibri" w:eastAsia="Calibri" w:hAnsi="Calibri"/>
@@ -75,15 +75,18 @@
         </w:rPr>
         <w:t xml:space="preserve">  ·  </w:t>
       </w:r>
-      <w:r>
-        <w:rPr>
-          <w:rFonts w:ascii="Calibri" w:cs="Calibri" w:eastAsia="Calibri" w:hAnsi="Calibri"/>
-          <w:color w:val="555555"/>
-          <w:sz w:val="18"/>
-          <w:szCs w:val="18"/>
-        </w:rPr>
-        <w:t xml:space="preserve">054-338-3953</w:t>
-      </w:r>
+      <w:hyperlink w:history="1" r:id="rIdyle4eikfjctrclj4w5bb0">
+        <w:r>
+          <w:rPr>
+            <w:rFonts w:ascii="Calibri" w:cs="Calibri" w:eastAsia="Calibri" w:hAnsi="Calibri"/>
+            <w:color w:val="1A3A6E"/>
+            <w:sz w:val="18"/>
+            <w:szCs w:val="18"/>
+            <w:u w:val="single"/>
+          </w:rPr>
+          <w:t xml:space="preserve">054-338-3953</w:t>
+        </w:r>
+      </w:hyperlink>
       <w:r>
         <w:rPr>
           <w:rFonts w:ascii="Calibri" w:cs="Calibri" w:eastAsia="Calibri" w:hAnsi="Calibri"/>
@@ -93,7 +96,7 @@
         </w:rPr>
         <w:t xml:space="preserve">  ·  </w:t>
       </w:r>
-      <w:hyperlink w:history="1" r:id="rIdrh8h1fowi7b_tajzi9p4k">
+      <w:hyperlink w:history="1" r:id="rId4vwbxga6bnh8tqlb8idl0">
         <w:r>
           <w:rPr>
             <w:rFonts w:ascii="Calibri" w:cs="Calibri" w:eastAsia="Calibri" w:hAnsi="Calibri"/>
@@ -114,7 +117,7 @@
         </w:rPr>
         <w:t xml:space="preserve">  ·  </w:t>
       </w:r>
-      <w:hyperlink w:history="1" r:id="rIditxpouanqnqylpbwm9jiq">
+      <w:hyperlink w:history="1" r:id="rIdq9twwv25gdtlcsgo9xcx4">
         <w:r>
           <w:rPr>
             <w:rFonts w:ascii="Calibri" w:cs="Calibri" w:eastAsia="Calibri" w:hAnsi="Calibri"/>
@@ -123,7 +126,7 @@
             <w:szCs w:val="18"/>
             <w:u w:val="single"/>
           </w:rPr>
-          <w:t xml:space="preserve">linkedin.com/in/ori-cohen-hello</w:t>
+          <w:t xml:space="preserve">LinkedIn</w:t>
         </w:r>
       </w:hyperlink>
     </w:p>
@@ -459,7 +462,7 @@
           <w:sz w:val="20"/>
           <w:szCs w:val="20"/>
         </w:rPr>
-        <w:t xml:space="preserve">Led user interviews and research that directly shaped feature prioritization with product managers, growing from individual contributor to senior designer in two and a half years.</w:t>
+        <w:t xml:space="preserve">Led user interviews and research that directly shaped feature prioritization with product managers, and grew from individual contributor to team lead in two and a half years.</w:t>
       </w:r>
     </w:p>
     <w:p>

</xml_diff>